<commit_message>
B3: rewrite copy to lead with velocity, drop category/city
Social posts now lead with the investment invitation (velocity-of-money
thesis: "don't let your money sit still", "your next opportunity is
almost here") instead of the specific opportunity's category and city.
Category and city are removed from the templates entirely to avoid
overlap with the parent company's POS business lines.

Variable set reduced from 12 to 7. Remaining tokens all directly
relevant to the investment decision:
target_return, tenor, funded_pct, open_time, next_open_day,
investor_count, funded_hours.

App default switched to populated (showing sample values); "Show slots"
becomes the explicit toggle choice.

Co-Authored-By: Claude Opus 4.7 (1M context) <noreply@anthropic.com>
</commit_message>
<xml_diff>
--- a/b3/copy-template.docx
+++ b/b3/copy-template.docx
@@ -295,7 +295,7 @@
           <w:sz w:val="22"/>
           <w:szCs w:val="22"/>
         </w:rPr>
-        <w:t xml:space="preserve">Ten variable slots are used across the phases. Not every phase uses every slot; generic phases use none.</w:t>
+        <w:t xml:space="preserve">Seven slots used across the phases, each directly relevant to the investment decision. Generic phases use none. Category and city do not appear in the social copy, which keeps the messaging clear of the parent company's POS lines.</w:t>
       </w:r>
     </w:p>
     <w:p>
@@ -309,7 +309,7 @@
           <w:sz w:val="20"/>
           <w:szCs w:val="20"/>
         </w:rPr>
-        <w:t xml:space="preserve">{{category}}       The asset type (e.g. POS financing, invoice financing, monthly installment).</w:t>
+        <w:t xml:space="preserve">{{target_return}}  Target annual rate as a number (e.g. 7.8).</w:t>
       </w:r>
     </w:p>
     <w:p>
@@ -323,7 +323,7 @@
           <w:sz w:val="20"/>
           <w:szCs w:val="20"/>
         </w:rPr>
-        <w:t xml:space="preserve">{{city}}           The SME location (e.g. Riyadh, Jeddah).</w:t>
+        <w:t xml:space="preserve">{{tenor}}          Tenor in months (e.g. 24).</w:t>
       </w:r>
     </w:p>
     <w:p>
@@ -337,7 +337,7 @@
           <w:sz w:val="20"/>
           <w:szCs w:val="20"/>
         </w:rPr>
-        <w:t xml:space="preserve">{{target_return}}  Target annual rate as a number (e.g. 7.8).</w:t>
+        <w:t xml:space="preserve">{{funded_pct}}     Progress percentage, updated live (e.g. 62).</w:t>
       </w:r>
     </w:p>
     <w:p>
@@ -351,7 +351,7 @@
           <w:sz w:val="20"/>
           <w:szCs w:val="20"/>
         </w:rPr>
-        <w:t xml:space="preserve">{{tenor}}          Tenor in months (e.g. 24).</w:t>
+        <w:t xml:space="preserve">{{open_time}}      Opening time and timezone (e.g. 10:00 KSA).</w:t>
       </w:r>
     </w:p>
     <w:p>
@@ -365,7 +365,7 @@
           <w:sz w:val="20"/>
           <w:szCs w:val="20"/>
         </w:rPr>
-        <w:t xml:space="preserve">{{target_raise}}   Total raise amount (e.g. SAR 1.2M).</w:t>
+        <w:t xml:space="preserve">{{next_open_day}}  Next opportunity opening day.</w:t>
       </w:r>
     </w:p>
     <w:p>
@@ -379,7 +379,7 @@
           <w:sz w:val="20"/>
           <w:szCs w:val="20"/>
         </w:rPr>
-        <w:t xml:space="preserve">{{funded_pct}}     Progress percentage, updated live (e.g. 62).</w:t>
+        <w:t xml:space="preserve">{{investor_count}} Count of investors who joined an opportunity.</w:t>
       </w:r>
     </w:p>
     <w:p>
@@ -393,77 +393,7 @@
           <w:sz w:val="20"/>
           <w:szCs w:val="20"/>
         </w:rPr>
-        <w:t xml:space="preserve">{{open_time}}      Opening time and timezone (e.g. 10:00 KSA).</w:t>
-      </w:r>
-    </w:p>
-    <w:p>
-      <w:pPr>
-        <w:spacing w:after="60"/>
-      </w:pPr>
-      <w:r>
-        <w:rPr>
-          <w:rFonts w:ascii="Arial" w:cs="Arial" w:eastAsia="Arial" w:hAnsi="Arial"/>
-          <w:color w:val="A5830B"/>
-          <w:sz w:val="20"/>
-          <w:szCs w:val="20"/>
-        </w:rPr>
-        <w:t xml:space="preserve">{{open_day}}       Opening day label (e.g. Sunday).</w:t>
-      </w:r>
-    </w:p>
-    <w:p>
-      <w:pPr>
-        <w:spacing w:after="60"/>
-      </w:pPr>
-      <w:r>
-        <w:rPr>
-          <w:rFonts w:ascii="Arial" w:cs="Arial" w:eastAsia="Arial" w:hAnsi="Arial"/>
-          <w:color w:val="A5830B"/>
-          <w:sz w:val="20"/>
-          <w:szCs w:val="20"/>
-        </w:rPr>
-        <w:t xml:space="preserve">{{next_open_day}}  Next opportunity opening day.</w:t>
-      </w:r>
-    </w:p>
-    <w:p>
-      <w:pPr>
-        <w:spacing w:after="60"/>
-      </w:pPr>
-      <w:r>
-        <w:rPr>
-          <w:rFonts w:ascii="Arial" w:cs="Arial" w:eastAsia="Arial" w:hAnsi="Arial"/>
-          <w:color w:val="A5830B"/>
-          <w:sz w:val="20"/>
-          <w:szCs w:val="20"/>
-        </w:rPr>
-        <w:t xml:space="preserve">{{investor_count}} Count of investors who joined an opportunity.</w:t>
-      </w:r>
-    </w:p>
-    <w:p>
-      <w:pPr>
-        <w:spacing w:after="60"/>
-      </w:pPr>
-      <w:r>
-        <w:rPr>
-          <w:rFonts w:ascii="Arial" w:cs="Arial" w:eastAsia="Arial" w:hAnsi="Arial"/>
-          <w:color w:val="A5830B"/>
-          <w:sz w:val="20"/>
-          <w:szCs w:val="20"/>
-        </w:rPr>
         <w:t xml:space="preserve">{{funded_hours}}   Hours from open to full funding.</w:t>
-      </w:r>
-    </w:p>
-    <w:p>
-      <w:pPr>
-        <w:spacing w:after="60"/>
-      </w:pPr>
-      <w:r>
-        <w:rPr>
-          <w:rFonts w:ascii="Arial" w:cs="Arial" w:eastAsia="Arial" w:hAnsi="Arial"/>
-          <w:color w:val="A5830B"/>
-          <w:sz w:val="20"/>
-          <w:szCs w:val="20"/>
-        </w:rPr>
-        <w:t xml:space="preserve">{{opportunity_name}} Short internal label (e.g. POS Jeddah 24-mo).</w:t>
       </w:r>
     </w:p>
     <w:p>
@@ -611,136 +541,6 @@
                 <w:sz w:val="20"/>
                 <w:szCs w:val="20"/>
               </w:rPr>
-              <w:t xml:space="preserve">category</w:t>
-            </w:r>
-          </w:p>
-        </w:tc>
-        <w:tc>
-          <w:tcPr>
-            <w:tcW w:type="dxa" w:w="3120"/>
-            <w:tcMar>
-              <w:top w:type="dxa" w:w="80"/>
-              <w:left w:type="dxa" w:w="120"/>
-              <w:bottom w:type="dxa" w:w="80"/>
-              <w:right w:type="dxa" w:w="120"/>
-            </w:tcMar>
-          </w:tcPr>
-          <w:p>
-            <w:r>
-              <w:rPr>
-                <w:rFonts w:ascii="Arial" w:cs="Arial" w:eastAsia="Arial" w:hAnsi="Arial"/>
-                <w:sz w:val="20"/>
-                <w:szCs w:val="20"/>
-              </w:rPr>
-              <w:t xml:space="preserve">POS financing</w:t>
-            </w:r>
-          </w:p>
-        </w:tc>
-        <w:tc>
-          <w:tcPr>
-            <w:tcW w:type="dxa" w:w="3120"/>
-            <w:tcMar>
-              <w:top w:type="dxa" w:w="80"/>
-              <w:left w:type="dxa" w:w="120"/>
-              <w:bottom w:type="dxa" w:w="80"/>
-              <w:right w:type="dxa" w:w="120"/>
-            </w:tcMar>
-          </w:tcPr>
-          <w:p>
-            <w:r>
-              <w:rPr>
-                <w:rFonts w:ascii="Arial" w:cs="Arial" w:eastAsia="Arial" w:hAnsi="Arial"/>
-                <w:sz w:val="20"/>
-                <w:szCs w:val="20"/>
-              </w:rPr>
-              <w:t xml:space="preserve">تمويل نقاط البيع</w:t>
-            </w:r>
-          </w:p>
-        </w:tc>
-      </w:tr>
-      <w:tr>
-        <w:tc>
-          <w:tcPr>
-            <w:tcW w:type="dxa" w:w="3120"/>
-            <w:tcMar>
-              <w:top w:type="dxa" w:w="80"/>
-              <w:left w:type="dxa" w:w="120"/>
-              <w:bottom w:type="dxa" w:w="80"/>
-              <w:right w:type="dxa" w:w="120"/>
-            </w:tcMar>
-          </w:tcPr>
-          <w:p>
-            <w:r>
-              <w:rPr>
-                <w:rFonts w:ascii="Arial" w:cs="Arial" w:eastAsia="Arial" w:hAnsi="Arial"/>
-                <w:sz w:val="20"/>
-                <w:szCs w:val="20"/>
-              </w:rPr>
-              <w:t xml:space="preserve">city</w:t>
-            </w:r>
-          </w:p>
-        </w:tc>
-        <w:tc>
-          <w:tcPr>
-            <w:tcW w:type="dxa" w:w="3120"/>
-            <w:tcMar>
-              <w:top w:type="dxa" w:w="80"/>
-              <w:left w:type="dxa" w:w="120"/>
-              <w:bottom w:type="dxa" w:w="80"/>
-              <w:right w:type="dxa" w:w="120"/>
-            </w:tcMar>
-          </w:tcPr>
-          <w:p>
-            <w:r>
-              <w:rPr>
-                <w:rFonts w:ascii="Arial" w:cs="Arial" w:eastAsia="Arial" w:hAnsi="Arial"/>
-                <w:sz w:val="20"/>
-                <w:szCs w:val="20"/>
-              </w:rPr>
-              <w:t xml:space="preserve">Jeddah</w:t>
-            </w:r>
-          </w:p>
-        </w:tc>
-        <w:tc>
-          <w:tcPr>
-            <w:tcW w:type="dxa" w:w="3120"/>
-            <w:tcMar>
-              <w:top w:type="dxa" w:w="80"/>
-              <w:left w:type="dxa" w:w="120"/>
-              <w:bottom w:type="dxa" w:w="80"/>
-              <w:right w:type="dxa" w:w="120"/>
-            </w:tcMar>
-          </w:tcPr>
-          <w:p>
-            <w:r>
-              <w:rPr>
-                <w:rFonts w:ascii="Arial" w:cs="Arial" w:eastAsia="Arial" w:hAnsi="Arial"/>
-                <w:sz w:val="20"/>
-                <w:szCs w:val="20"/>
-              </w:rPr>
-              <w:t xml:space="preserve">جدة</w:t>
-            </w:r>
-          </w:p>
-        </w:tc>
-      </w:tr>
-      <w:tr>
-        <w:tc>
-          <w:tcPr>
-            <w:tcW w:type="dxa" w:w="3120"/>
-            <w:tcMar>
-              <w:top w:type="dxa" w:w="80"/>
-              <w:left w:type="dxa" w:w="120"/>
-              <w:bottom w:type="dxa" w:w="80"/>
-              <w:right w:type="dxa" w:w="120"/>
-            </w:tcMar>
-          </w:tcPr>
-          <w:p>
-            <w:r>
-              <w:rPr>
-                <w:rFonts w:ascii="Arial" w:cs="Arial" w:eastAsia="Arial" w:hAnsi="Arial"/>
-                <w:sz w:val="20"/>
-                <w:szCs w:val="20"/>
-              </w:rPr>
               <w:t xml:space="preserve">target_return</w:t>
             </w:r>
           </w:p>
@@ -783,7 +583,7 @@
                 <w:sz w:val="20"/>
                 <w:szCs w:val="20"/>
               </w:rPr>
-              <w:t xml:space="preserve">—</w:t>
+              <w:t xml:space="preserve">٧٫٨</w:t>
             </w:r>
           </w:p>
         </w:tc>
@@ -848,72 +648,7 @@
                 <w:sz w:val="20"/>
                 <w:szCs w:val="20"/>
               </w:rPr>
-              <w:t xml:space="preserve">—</w:t>
-            </w:r>
-          </w:p>
-        </w:tc>
-      </w:tr>
-      <w:tr>
-        <w:tc>
-          <w:tcPr>
-            <w:tcW w:type="dxa" w:w="3120"/>
-            <w:tcMar>
-              <w:top w:type="dxa" w:w="80"/>
-              <w:left w:type="dxa" w:w="120"/>
-              <w:bottom w:type="dxa" w:w="80"/>
-              <w:right w:type="dxa" w:w="120"/>
-            </w:tcMar>
-          </w:tcPr>
-          <w:p>
-            <w:r>
-              <w:rPr>
-                <w:rFonts w:ascii="Arial" w:cs="Arial" w:eastAsia="Arial" w:hAnsi="Arial"/>
-                <w:sz w:val="20"/>
-                <w:szCs w:val="20"/>
-              </w:rPr>
-              <w:t xml:space="preserve">target_raise</w:t>
-            </w:r>
-          </w:p>
-        </w:tc>
-        <w:tc>
-          <w:tcPr>
-            <w:tcW w:type="dxa" w:w="3120"/>
-            <w:tcMar>
-              <w:top w:type="dxa" w:w="80"/>
-              <w:left w:type="dxa" w:w="120"/>
-              <w:bottom w:type="dxa" w:w="80"/>
-              <w:right w:type="dxa" w:w="120"/>
-            </w:tcMar>
-          </w:tcPr>
-          <w:p>
-            <w:r>
-              <w:rPr>
-                <w:rFonts w:ascii="Arial" w:cs="Arial" w:eastAsia="Arial" w:hAnsi="Arial"/>
-                <w:sz w:val="20"/>
-                <w:szCs w:val="20"/>
-              </w:rPr>
-              <w:t xml:space="preserve">SAR 1.2M</w:t>
-            </w:r>
-          </w:p>
-        </w:tc>
-        <w:tc>
-          <w:tcPr>
-            <w:tcW w:type="dxa" w:w="3120"/>
-            <w:tcMar>
-              <w:top w:type="dxa" w:w="80"/>
-              <w:left w:type="dxa" w:w="120"/>
-              <w:bottom w:type="dxa" w:w="80"/>
-              <w:right w:type="dxa" w:w="120"/>
-            </w:tcMar>
-          </w:tcPr>
-          <w:p>
-            <w:r>
-              <w:rPr>
-                <w:rFonts w:ascii="Arial" w:cs="Arial" w:eastAsia="Arial" w:hAnsi="Arial"/>
-                <w:sz w:val="20"/>
-                <w:szCs w:val="20"/>
-              </w:rPr>
-              <w:t xml:space="preserve">١٫٢ مليون ريال</w:t>
+              <w:t xml:space="preserve">٢٤</w:t>
             </w:r>
           </w:p>
         </w:tc>
@@ -978,72 +713,7 @@
                 <w:sz w:val="20"/>
                 <w:szCs w:val="20"/>
               </w:rPr>
-              <w:t xml:space="preserve">—</w:t>
-            </w:r>
-          </w:p>
-        </w:tc>
-      </w:tr>
-      <w:tr>
-        <w:tc>
-          <w:tcPr>
-            <w:tcW w:type="dxa" w:w="3120"/>
-            <w:tcMar>
-              <w:top w:type="dxa" w:w="80"/>
-              <w:left w:type="dxa" w:w="120"/>
-              <w:bottom w:type="dxa" w:w="80"/>
-              <w:right w:type="dxa" w:w="120"/>
-            </w:tcMar>
-          </w:tcPr>
-          <w:p>
-            <w:r>
-              <w:rPr>
-                <w:rFonts w:ascii="Arial" w:cs="Arial" w:eastAsia="Arial" w:hAnsi="Arial"/>
-                <w:sz w:val="20"/>
-                <w:szCs w:val="20"/>
-              </w:rPr>
-              <w:t xml:space="preserve">closes_in</w:t>
-            </w:r>
-          </w:p>
-        </w:tc>
-        <w:tc>
-          <w:tcPr>
-            <w:tcW w:type="dxa" w:w="3120"/>
-            <w:tcMar>
-              <w:top w:type="dxa" w:w="80"/>
-              <w:left w:type="dxa" w:w="120"/>
-              <w:bottom w:type="dxa" w:w="80"/>
-              <w:right w:type="dxa" w:w="120"/>
-            </w:tcMar>
-          </w:tcPr>
-          <w:p>
-            <w:r>
-              <w:rPr>
-                <w:rFonts w:ascii="Arial" w:cs="Arial" w:eastAsia="Arial" w:hAnsi="Arial"/>
-                <w:sz w:val="20"/>
-                <w:szCs w:val="20"/>
-              </w:rPr>
-              <w:t xml:space="preserve">3 days</w:t>
-            </w:r>
-          </w:p>
-        </w:tc>
-        <w:tc>
-          <w:tcPr>
-            <w:tcW w:type="dxa" w:w="3120"/>
-            <w:tcMar>
-              <w:top w:type="dxa" w:w="80"/>
-              <w:left w:type="dxa" w:w="120"/>
-              <w:bottom w:type="dxa" w:w="80"/>
-              <w:right w:type="dxa" w:w="120"/>
-            </w:tcMar>
-          </w:tcPr>
-          <w:p>
-            <w:r>
-              <w:rPr>
-                <w:rFonts w:ascii="Arial" w:cs="Arial" w:eastAsia="Arial" w:hAnsi="Arial"/>
-                <w:sz w:val="20"/>
-                <w:szCs w:val="20"/>
-              </w:rPr>
-              <w:t xml:space="preserve">٣ أيام</w:t>
+              <w:t xml:space="preserve">٦٢</w:t>
             </w:r>
           </w:p>
         </w:tc>
@@ -1108,72 +778,7 @@
                 <w:sz w:val="20"/>
                 <w:szCs w:val="20"/>
               </w:rPr>
-              <w:t xml:space="preserve">١٠:٠٠ ص</w:t>
-            </w:r>
-          </w:p>
-        </w:tc>
-      </w:tr>
-      <w:tr>
-        <w:tc>
-          <w:tcPr>
-            <w:tcW w:type="dxa" w:w="3120"/>
-            <w:tcMar>
-              <w:top w:type="dxa" w:w="80"/>
-              <w:left w:type="dxa" w:w="120"/>
-              <w:bottom w:type="dxa" w:w="80"/>
-              <w:right w:type="dxa" w:w="120"/>
-            </w:tcMar>
-          </w:tcPr>
-          <w:p>
-            <w:r>
-              <w:rPr>
-                <w:rFonts w:ascii="Arial" w:cs="Arial" w:eastAsia="Arial" w:hAnsi="Arial"/>
-                <w:sz w:val="20"/>
-                <w:szCs w:val="20"/>
-              </w:rPr>
-              <w:t xml:space="preserve">open_day</w:t>
-            </w:r>
-          </w:p>
-        </w:tc>
-        <w:tc>
-          <w:tcPr>
-            <w:tcW w:type="dxa" w:w="3120"/>
-            <w:tcMar>
-              <w:top w:type="dxa" w:w="80"/>
-              <w:left w:type="dxa" w:w="120"/>
-              <w:bottom w:type="dxa" w:w="80"/>
-              <w:right w:type="dxa" w:w="120"/>
-            </w:tcMar>
-          </w:tcPr>
-          <w:p>
-            <w:r>
-              <w:rPr>
-                <w:rFonts w:ascii="Arial" w:cs="Arial" w:eastAsia="Arial" w:hAnsi="Arial"/>
-                <w:sz w:val="20"/>
-                <w:szCs w:val="20"/>
-              </w:rPr>
-              <w:t xml:space="preserve">Sunday</w:t>
-            </w:r>
-          </w:p>
-        </w:tc>
-        <w:tc>
-          <w:tcPr>
-            <w:tcW w:type="dxa" w:w="3120"/>
-            <w:tcMar>
-              <w:top w:type="dxa" w:w="80"/>
-              <w:left w:type="dxa" w:w="120"/>
-              <w:bottom w:type="dxa" w:w="80"/>
-              <w:right w:type="dxa" w:w="120"/>
-            </w:tcMar>
-          </w:tcPr>
-          <w:p>
-            <w:r>
-              <w:rPr>
-                <w:rFonts w:ascii="Arial" w:cs="Arial" w:eastAsia="Arial" w:hAnsi="Arial"/>
-                <w:sz w:val="20"/>
-                <w:szCs w:val="20"/>
-              </w:rPr>
-              <w:t xml:space="preserve">الأحد</w:t>
+              <w:t xml:space="preserve">١٠:٠٠ صباحاً</w:t>
             </w:r>
           </w:p>
         </w:tc>
@@ -1373,71 +978,6 @@
           </w:p>
         </w:tc>
       </w:tr>
-      <w:tr>
-        <w:tc>
-          <w:tcPr>
-            <w:tcW w:type="dxa" w:w="3120"/>
-            <w:tcMar>
-              <w:top w:type="dxa" w:w="80"/>
-              <w:left w:type="dxa" w:w="120"/>
-              <w:bottom w:type="dxa" w:w="80"/>
-              <w:right w:type="dxa" w:w="120"/>
-            </w:tcMar>
-          </w:tcPr>
-          <w:p>
-            <w:r>
-              <w:rPr>
-                <w:rFonts w:ascii="Arial" w:cs="Arial" w:eastAsia="Arial" w:hAnsi="Arial"/>
-                <w:sz w:val="20"/>
-                <w:szCs w:val="20"/>
-              </w:rPr>
-              <w:t xml:space="preserve">opportunity_name</w:t>
-            </w:r>
-          </w:p>
-        </w:tc>
-        <w:tc>
-          <w:tcPr>
-            <w:tcW w:type="dxa" w:w="3120"/>
-            <w:tcMar>
-              <w:top w:type="dxa" w:w="80"/>
-              <w:left w:type="dxa" w:w="120"/>
-              <w:bottom w:type="dxa" w:w="80"/>
-              <w:right w:type="dxa" w:w="120"/>
-            </w:tcMar>
-          </w:tcPr>
-          <w:p>
-            <w:r>
-              <w:rPr>
-                <w:rFonts w:ascii="Arial" w:cs="Arial" w:eastAsia="Arial" w:hAnsi="Arial"/>
-                <w:sz w:val="20"/>
-                <w:szCs w:val="20"/>
-              </w:rPr>
-              <w:t xml:space="preserve">POS Jeddah 24-mo</w:t>
-            </w:r>
-          </w:p>
-        </w:tc>
-        <w:tc>
-          <w:tcPr>
-            <w:tcW w:type="dxa" w:w="3120"/>
-            <w:tcMar>
-              <w:top w:type="dxa" w:w="80"/>
-              <w:left w:type="dxa" w:w="120"/>
-              <w:bottom w:type="dxa" w:w="80"/>
-              <w:right w:type="dxa" w:w="120"/>
-            </w:tcMar>
-          </w:tcPr>
-          <w:p>
-            <w:r>
-              <w:rPr>
-                <w:rFonts w:ascii="Arial" w:cs="Arial" w:eastAsia="Arial" w:hAnsi="Arial"/>
-                <w:sz w:val="20"/>
-                <w:szCs w:val="20"/>
-              </w:rPr>
-              <w:t xml:space="preserve">نقاط بيع جدة ٢٤ شهراً</w:t>
-            </w:r>
-          </w:p>
-        </w:tc>
-      </w:tr>
     </w:tbl>
     <w:p>
       <w:r>
@@ -1488,7 +1028,7 @@
           <w:sz w:val="20"/>
           <w:szCs w:val="20"/>
         </w:rPr>
-        <w:t xml:space="preserve">T minus 5 to 3 days. Use when the next opportunity has been confirmed but details are not yet public.</w:t>
+        <w:t xml:space="preserve">T minus 5 to 3 days.</w:t>
       </w:r>
     </w:p>
     <w:p>
@@ -1558,33 +1098,33 @@
           <w:sz w:val="22"/>
           <w:szCs w:val="22"/>
         </w:rPr>
-        <w:t xml:space="preserve">Headline:  A new opportunity this week.</w:t>
-      </w:r>
-    </w:p>
-    <w:p>
-      <w:pPr>
-        <w:spacing w:after="100"/>
-      </w:pPr>
-      <w:r>
-        <w:rPr>
-          <w:rFonts w:ascii="Arial" w:cs="Arial" w:eastAsia="Arial" w:hAnsi="Arial"/>
-          <w:sz w:val="22"/>
-          <w:szCs w:val="22"/>
-        </w:rPr>
-        <w:t xml:space="preserve">Body:      A new SME financing opportunity launches on Alraedah Invest in the coming days.</w:t>
-      </w:r>
-    </w:p>
-    <w:p>
-      <w:pPr>
-        <w:spacing w:after="100"/>
-      </w:pPr>
-      <w:r>
-        <w:rPr>
-          <w:rFonts w:ascii="Arial" w:cs="Arial" w:eastAsia="Arial" w:hAnsi="Arial"/>
-          <w:sz w:val="22"/>
-          <w:szCs w:val="22"/>
-        </w:rPr>
-        <w:t xml:space="preserve">Chips:     From SAR 1,000  ·  Weekly cadence</w:t>
+        <w:t xml:space="preserve">Headline:  Don't let your money sit still.</w:t>
+      </w:r>
+    </w:p>
+    <w:p>
+      <w:pPr>
+        <w:spacing w:after="100"/>
+      </w:pPr>
+      <w:r>
+        <w:rPr>
+          <w:rFonts w:ascii="Arial" w:cs="Arial" w:eastAsia="Arial" w:hAnsi="Arial"/>
+          <w:sz w:val="22"/>
+          <w:szCs w:val="22"/>
+        </w:rPr>
+        <w:t xml:space="preserve">Body:      A new investment opportunity opens on Alraedah Invest in the coming days.</w:t>
+      </w:r>
+    </w:p>
+    <w:p>
+      <w:pPr>
+        <w:spacing w:after="100"/>
+      </w:pPr>
+      <w:r>
+        <w:rPr>
+          <w:rFonts w:ascii="Arial" w:cs="Arial" w:eastAsia="Arial" w:hAnsi="Arial"/>
+          <w:sz w:val="22"/>
+          <w:szCs w:val="22"/>
+        </w:rPr>
+        <w:t xml:space="preserve">Chips:     From SAR 1,000  ·  Monthly payouts</w:t>
       </w:r>
     </w:p>
     <w:p>
@@ -1648,39 +1188,39 @@
           <w:szCs w:val="22"/>
           <w:rtl/>
         </w:rPr>
-        <w:t xml:space="preserve">العنوان:    فرصة استثمارية جديدة هذا الأسبوع</w:t>
-      </w:r>
-    </w:p>
-    <w:p>
-      <w:pPr>
-        <w:bidi/>
-        <w:spacing w:after="100"/>
-        <w:jc w:val="right"/>
-      </w:pPr>
-      <w:r>
-        <w:rPr>
-          <w:rFonts w:ascii="Arial" w:cs="Arial" w:eastAsia="Arial" w:hAnsi="Arial"/>
-          <w:sz w:val="22"/>
-          <w:szCs w:val="22"/>
-          <w:rtl/>
-        </w:rPr>
-        <w:t xml:space="preserve">النص:      نعلن قريباً عن طرح فرصة استثمارية جديدة على منصة الرائدة إنڤست.</w:t>
-      </w:r>
-    </w:p>
-    <w:p>
-      <w:pPr>
-        <w:bidi/>
-        <w:spacing w:after="100"/>
-        <w:jc w:val="right"/>
-      </w:pPr>
-      <w:r>
-        <w:rPr>
-          <w:rFonts w:ascii="Arial" w:cs="Arial" w:eastAsia="Arial" w:hAnsi="Arial"/>
-          <w:sz w:val="22"/>
-          <w:szCs w:val="22"/>
-          <w:rtl/>
-        </w:rPr>
-        <w:t xml:space="preserve">الشرائح:   تبدأ من ١,٠٠٠ ريال  ·  فرصة كل أسبوع</w:t>
+        <w:t xml:space="preserve">العنوان:    فلوسك تشتغل، لا تخلّيها ساكنة.</w:t>
+      </w:r>
+    </w:p>
+    <w:p>
+      <w:pPr>
+        <w:bidi/>
+        <w:spacing w:after="100"/>
+        <w:jc w:val="right"/>
+      </w:pPr>
+      <w:r>
+        <w:rPr>
+          <w:rFonts w:ascii="Arial" w:cs="Arial" w:eastAsia="Arial" w:hAnsi="Arial"/>
+          <w:sz w:val="22"/>
+          <w:szCs w:val="22"/>
+          <w:rtl/>
+        </w:rPr>
+        <w:t xml:space="preserve">النص:      فرصة استثمارية جديدة على منصة الرائدة إنڤست خلال الأيام القادمة.</w:t>
+      </w:r>
+    </w:p>
+    <w:p>
+      <w:pPr>
+        <w:bidi/>
+        <w:spacing w:after="100"/>
+        <w:jc w:val="right"/>
+      </w:pPr>
+      <w:r>
+        <w:rPr>
+          <w:rFonts w:ascii="Arial" w:cs="Arial" w:eastAsia="Arial" w:hAnsi="Arial"/>
+          <w:sz w:val="22"/>
+          <w:szCs w:val="22"/>
+          <w:rtl/>
+        </w:rPr>
+        <w:t xml:space="preserve">الشرائح:   تبدأ من ١,٠٠٠ ريال  ·  توزيعات شهرية</w:t>
       </w:r>
     </w:p>
     <w:p>
@@ -1737,7 +1277,7 @@
           <w:sz w:val="20"/>
           <w:szCs w:val="20"/>
         </w:rPr>
-        <w:t xml:space="preserve">T minus 2 to 1 days. Reveal the category, city, and headline numbers.</w:t>
+        <w:t xml:space="preserve">T minus 2 to 1 days.</w:t>
       </w:r>
     </w:p>
     <w:p>
@@ -1762,7 +1302,7 @@
           <w:sz w:val="20"/>
           <w:szCs w:val="20"/>
         </w:rPr>
-        <w:t xml:space="preserve">{{category}}, {{city}}, {{target_return}}, {{tenor}}, {{target_raise}}</w:t>
+        <w:t xml:space="preserve">{{target_return}}, {{tenor}}</w:t>
       </w:r>
     </w:p>
     <w:p>
@@ -1807,33 +1347,33 @@
           <w:sz w:val="22"/>
           <w:szCs w:val="22"/>
         </w:rPr>
-        <w:t xml:space="preserve">Headline:  {{category}}, {{city}}.</w:t>
-      </w:r>
-    </w:p>
-    <w:p>
-      <w:pPr>
-        <w:spacing w:after="100"/>
-      </w:pPr>
-      <w:r>
-        <w:rPr>
-          <w:rFonts w:ascii="Arial" w:cs="Arial" w:eastAsia="Arial" w:hAnsi="Arial"/>
-          <w:sz w:val="22"/>
-          <w:szCs w:val="22"/>
-        </w:rPr>
-        <w:t xml:space="preserve">Body:      Next opportunity on Alraedah Invest.</w:t>
-      </w:r>
-    </w:p>
-    <w:p>
-      <w:pPr>
-        <w:spacing w:after="100"/>
-      </w:pPr>
-      <w:r>
-        <w:rPr>
-          <w:rFonts w:ascii="Arial" w:cs="Arial" w:eastAsia="Arial" w:hAnsi="Arial"/>
-          <w:sz w:val="22"/>
-          <w:szCs w:val="22"/>
-        </w:rPr>
-        <w:t xml:space="preserve">Chips:     {{target_return}}% target p.a.  ·  {{tenor}} months  ·  {{target_raise}} target</w:t>
+        <w:t xml:space="preserve">Headline:  Your next opportunity is almost here.</w:t>
+      </w:r>
+    </w:p>
+    <w:p>
+      <w:pPr>
+        <w:spacing w:after="100"/>
+      </w:pPr>
+      <w:r>
+        <w:rPr>
+          <w:rFonts w:ascii="Arial" w:cs="Arial" w:eastAsia="Arial" w:hAnsi="Arial"/>
+          <w:sz w:val="22"/>
+          <w:szCs w:val="22"/>
+        </w:rPr>
+        <w:t xml:space="preserve">Body:      Opens this week on Alraedah Invest.</w:t>
+      </w:r>
+    </w:p>
+    <w:p>
+      <w:pPr>
+        <w:spacing w:after="100"/>
+      </w:pPr>
+      <w:r>
+        <w:rPr>
+          <w:rFonts w:ascii="Arial" w:cs="Arial" w:eastAsia="Arial" w:hAnsi="Arial"/>
+          <w:sz w:val="22"/>
+          <w:szCs w:val="22"/>
+        </w:rPr>
+        <w:t xml:space="preserve">Chips:     {{target_return}}% target p.a.  ·  {{tenor}} months  ·  From SAR 1,000</w:t>
       </w:r>
     </w:p>
     <w:p>
@@ -1897,39 +1437,39 @@
           <w:szCs w:val="22"/>
           <w:rtl/>
         </w:rPr>
-        <w:t xml:space="preserve">العنوان:    {{category}}، {{city}}</w:t>
-      </w:r>
-    </w:p>
-    <w:p>
-      <w:pPr>
-        <w:bidi/>
-        <w:spacing w:after="100"/>
-        <w:jc w:val="right"/>
-      </w:pPr>
-      <w:r>
-        <w:rPr>
-          <w:rFonts w:ascii="Arial" w:cs="Arial" w:eastAsia="Arial" w:hAnsi="Arial"/>
-          <w:sz w:val="22"/>
-          <w:szCs w:val="22"/>
-          <w:rtl/>
-        </w:rPr>
-        <w:t xml:space="preserve">النص:      الفرصة القادمة على منصة الرائدة إنڤست.</w:t>
-      </w:r>
-    </w:p>
-    <w:p>
-      <w:pPr>
-        <w:bidi/>
-        <w:spacing w:after="100"/>
-        <w:jc w:val="right"/>
-      </w:pPr>
-      <w:r>
-        <w:rPr>
-          <w:rFonts w:ascii="Arial" w:cs="Arial" w:eastAsia="Arial" w:hAnsi="Arial"/>
-          <w:sz w:val="22"/>
-          <w:szCs w:val="22"/>
-          <w:rtl/>
-        </w:rPr>
-        <w:t xml:space="preserve">الشرائح:   عائد مستهدف {{target_return}}٪ سنوياً  ·  مدة {{tenor}} شهر  ·  المستهدف {{target_raise}}</w:t>
+        <w:t xml:space="preserve">العنوان:    فرصتك القادمة على بُعد أيام.</w:t>
+      </w:r>
+    </w:p>
+    <w:p>
+      <w:pPr>
+        <w:bidi/>
+        <w:spacing w:after="100"/>
+        <w:jc w:val="right"/>
+      </w:pPr>
+      <w:r>
+        <w:rPr>
+          <w:rFonts w:ascii="Arial" w:cs="Arial" w:eastAsia="Arial" w:hAnsi="Arial"/>
+          <w:sz w:val="22"/>
+          <w:szCs w:val="22"/>
+          <w:rtl/>
+        </w:rPr>
+        <w:t xml:space="preserve">النص:      تُطرح هذا الأسبوع على منصة الرائدة إنڤست.</w:t>
+      </w:r>
+    </w:p>
+    <w:p>
+      <w:pPr>
+        <w:bidi/>
+        <w:spacing w:after="100"/>
+        <w:jc w:val="right"/>
+      </w:pPr>
+      <w:r>
+        <w:rPr>
+          <w:rFonts w:ascii="Arial" w:cs="Arial" w:eastAsia="Arial" w:hAnsi="Arial"/>
+          <w:sz w:val="22"/>
+          <w:szCs w:val="22"/>
+          <w:rtl/>
+        </w:rPr>
+        <w:t xml:space="preserve">الشرائح:   عائد مستهدف {{target_return}}٪ سنوياً  ·  مدة {{tenor}} شهر  ·  تبدأ من ١,٠٠٠ ريال</w:t>
       </w:r>
     </w:p>
     <w:p>
@@ -1986,7 +1526,7 @@
           <w:sz w:val="20"/>
           <w:szCs w:val="20"/>
         </w:rPr>
-        <w:t xml:space="preserve">T minus 1 day. Push "top up your wallet" and build anticipation.</w:t>
+        <w:t xml:space="preserve">T minus 1 day.</w:t>
       </w:r>
     </w:p>
     <w:p>
@@ -2056,7 +1596,7 @@
           <w:sz w:val="22"/>
           <w:szCs w:val="22"/>
         </w:rPr>
-        <w:t xml:space="preserve">Headline:  A new opportunity opens tomorrow.</w:t>
+        <w:t xml:space="preserve">Headline:  Your next opportunity opens tomorrow.</w:t>
       </w:r>
     </w:p>
     <w:p>
@@ -2146,23 +1686,23 @@
           <w:szCs w:val="22"/>
           <w:rtl/>
         </w:rPr>
-        <w:t xml:space="preserve">العنوان:    غداً يُطرح استثمار جديد على المنصة.</w:t>
-      </w:r>
-    </w:p>
-    <w:p>
-      <w:pPr>
-        <w:bidi/>
-        <w:spacing w:after="100"/>
-        <w:jc w:val="right"/>
-      </w:pPr>
-      <w:r>
-        <w:rPr>
-          <w:rFonts w:ascii="Arial" w:cs="Arial" w:eastAsia="Arial" w:hAnsi="Arial"/>
-          <w:sz w:val="22"/>
-          <w:szCs w:val="22"/>
-          <w:rtl/>
-        </w:rPr>
-        <w:t xml:space="preserve">النص:      الفرص عادةً تتغطى خلال ٢٤ ساعة من الطرح. اشحن محفظتك اليوم.</w:t>
+        <w:t xml:space="preserve">العنوان:    فرصتك الجديدة تُطرح غداً.</w:t>
+      </w:r>
+    </w:p>
+    <w:p>
+      <w:pPr>
+        <w:bidi/>
+        <w:spacing w:after="100"/>
+        <w:jc w:val="right"/>
+      </w:pPr>
+      <w:r>
+        <w:rPr>
+          <w:rFonts w:ascii="Arial" w:cs="Arial" w:eastAsia="Arial" w:hAnsi="Arial"/>
+          <w:sz w:val="22"/>
+          <w:szCs w:val="22"/>
+          <w:rtl/>
+        </w:rPr>
+        <w:t xml:space="preserve">النص:      الفرص عادةً تتغطى خلال ٢٤ ساعة من الطرح. اشحن محفظتك اليوم لتكون جاهزاً.</w:t>
       </w:r>
     </w:p>
     <w:p>
@@ -2235,7 +1775,7 @@
           <w:sz w:val="20"/>
           <w:szCs w:val="20"/>
         </w:rPr>
-        <w:t xml:space="preserve">T minus 1 day, final push. Combine category, city, and headline numbers.</w:t>
+        <w:t xml:space="preserve">T minus 1 day, final push.</w:t>
       </w:r>
     </w:p>
     <w:p>
@@ -2260,7 +1800,7 @@
           <w:sz w:val="20"/>
           <w:szCs w:val="20"/>
         </w:rPr>
-        <w:t xml:space="preserve">{{open_time}}, {{category}}, {{city}}, {{target_return}}, {{tenor}}, {{target_raise}}</w:t>
+        <w:t xml:space="preserve">{{open_time}}, {{target_return}}, {{tenor}}</w:t>
       </w:r>
     </w:p>
     <w:p>
@@ -2305,33 +1845,33 @@
           <w:sz w:val="22"/>
           <w:szCs w:val="22"/>
         </w:rPr>
-        <w:t xml:space="preserve">Headline:  {{category}}, {{city}}.</w:t>
-      </w:r>
-    </w:p>
-    <w:p>
-      <w:pPr>
-        <w:spacing w:after="100"/>
-      </w:pPr>
-      <w:r>
-        <w:rPr>
-          <w:rFonts w:ascii="Arial" w:cs="Arial" w:eastAsia="Arial" w:hAnsi="Arial"/>
-          <w:sz w:val="22"/>
-          <w:szCs w:val="22"/>
-        </w:rPr>
-        <w:t xml:space="preserve">Body:      Opens tomorrow on Alraedah Invest. Alraedah co-invests 25% alongside you.</w:t>
-      </w:r>
-    </w:p>
-    <w:p>
-      <w:pPr>
-        <w:spacing w:after="100"/>
-      </w:pPr>
-      <w:r>
-        <w:rPr>
-          <w:rFonts w:ascii="Arial" w:cs="Arial" w:eastAsia="Arial" w:hAnsi="Arial"/>
-          <w:sz w:val="22"/>
-          <w:szCs w:val="22"/>
-        </w:rPr>
-        <w:t xml:space="preserve">Chips:     {{target_return}}% target p.a.  ·  {{tenor}} months  ·  {{target_raise}} target</w:t>
+        <w:t xml:space="preserve">Headline:  Your money could start working tomorrow.</w:t>
+      </w:r>
+    </w:p>
+    <w:p>
+      <w:pPr>
+        <w:spacing w:after="100"/>
+      </w:pPr>
+      <w:r>
+        <w:rPr>
+          <w:rFonts w:ascii="Arial" w:cs="Arial" w:eastAsia="Arial" w:hAnsi="Arial"/>
+          <w:sz w:val="22"/>
+          <w:szCs w:val="22"/>
+        </w:rPr>
+        <w:t xml:space="preserve">Body:      A new Alraedah Invest opportunity opens tomorrow. Alraedah co-invests 25% alongside you.</w:t>
+      </w:r>
+    </w:p>
+    <w:p>
+      <w:pPr>
+        <w:spacing w:after="100"/>
+      </w:pPr>
+      <w:r>
+        <w:rPr>
+          <w:rFonts w:ascii="Arial" w:cs="Arial" w:eastAsia="Arial" w:hAnsi="Arial"/>
+          <w:sz w:val="22"/>
+          <w:szCs w:val="22"/>
+        </w:rPr>
+        <w:t xml:space="preserve">Chips:     {{target_return}}% target p.a.  ·  {{tenor}} months  ·  From SAR 1,000</w:t>
       </w:r>
     </w:p>
     <w:p>
@@ -2395,39 +1935,39 @@
           <w:szCs w:val="22"/>
           <w:rtl/>
         </w:rPr>
-        <w:t xml:space="preserve">العنوان:    {{category}}، {{city}}</w:t>
-      </w:r>
-    </w:p>
-    <w:p>
-      <w:pPr>
-        <w:bidi/>
-        <w:spacing w:after="100"/>
-        <w:jc w:val="right"/>
-      </w:pPr>
-      <w:r>
-        <w:rPr>
-          <w:rFonts w:ascii="Arial" w:cs="Arial" w:eastAsia="Arial" w:hAnsi="Arial"/>
-          <w:sz w:val="22"/>
-          <w:szCs w:val="22"/>
-          <w:rtl/>
-        </w:rPr>
-        <w:t xml:space="preserve">النص:      تُطرح غداً على منصة الرائدة إنڤست. الرائدة تستثمر بنسبة ٢٥٪ معك.</w:t>
-      </w:r>
-    </w:p>
-    <w:p>
-      <w:pPr>
-        <w:bidi/>
-        <w:spacing w:after="100"/>
-        <w:jc w:val="right"/>
-      </w:pPr>
-      <w:r>
-        <w:rPr>
-          <w:rFonts w:ascii="Arial" w:cs="Arial" w:eastAsia="Arial" w:hAnsi="Arial"/>
-          <w:sz w:val="22"/>
-          <w:szCs w:val="22"/>
-          <w:rtl/>
-        </w:rPr>
-        <w:t xml:space="preserve">الشرائح:   عائد مستهدف {{target_return}}٪ سنوياً  ·  مدة {{tenor}} شهر  ·  المستهدف {{target_raise}}</w:t>
+        <w:t xml:space="preserve">العنوان:    فلوسك ممكن تشتغل من بكرة.</w:t>
+      </w:r>
+    </w:p>
+    <w:p>
+      <w:pPr>
+        <w:bidi/>
+        <w:spacing w:after="100"/>
+        <w:jc w:val="right"/>
+      </w:pPr>
+      <w:r>
+        <w:rPr>
+          <w:rFonts w:ascii="Arial" w:cs="Arial" w:eastAsia="Arial" w:hAnsi="Arial"/>
+          <w:sz w:val="22"/>
+          <w:szCs w:val="22"/>
+          <w:rtl/>
+        </w:rPr>
+        <w:t xml:space="preserve">النص:      فرصة استثمارية جديدة تُطرح غداً على منصة الرائدة إنڤست. الرائدة تستثمر بنسبة ٢٥٪ معك.</w:t>
+      </w:r>
+    </w:p>
+    <w:p>
+      <w:pPr>
+        <w:bidi/>
+        <w:spacing w:after="100"/>
+        <w:jc w:val="right"/>
+      </w:pPr>
+      <w:r>
+        <w:rPr>
+          <w:rFonts w:ascii="Arial" w:cs="Arial" w:eastAsia="Arial" w:hAnsi="Arial"/>
+          <w:sz w:val="22"/>
+          <w:szCs w:val="22"/>
+          <w:rtl/>
+        </w:rPr>
+        <w:t xml:space="preserve">الشرائح:   عائد مستهدف {{target_return}}٪ سنوياً  ·  مدة {{tenor}} شهر  ·  تبدأ من ١,٠٠٠ ريال</w:t>
       </w:r>
     </w:p>
     <w:p>
@@ -2484,7 +2024,7 @@
           <w:sz w:val="20"/>
           <w:szCs w:val="20"/>
         </w:rPr>
-        <w:t xml:space="preserve">T = 0. Goes live the moment the opportunity is open for investment.</w:t>
+        <w:t xml:space="preserve">T = 0.</w:t>
       </w:r>
     </w:p>
     <w:p>
@@ -2554,7 +2094,7 @@
           <w:sz w:val="22"/>
           <w:szCs w:val="22"/>
         </w:rPr>
-        <w:t xml:space="preserve">Headline:  A new opportunity is live.</w:t>
+        <w:t xml:space="preserve">Headline:  A new way to put your money to work.</w:t>
       </w:r>
     </w:p>
     <w:p>
@@ -2580,7 +2120,7 @@
           <w:sz w:val="22"/>
           <w:szCs w:val="22"/>
         </w:rPr>
-        <w:t xml:space="preserve">Chips:     Open now  ·  From SAR 1,000</w:t>
+        <w:t xml:space="preserve">Chips:     Open now  ·  Monthly payouts  ·  From SAR 1,000</w:t>
       </w:r>
     </w:p>
     <w:p>
@@ -2644,7 +2184,7 @@
           <w:szCs w:val="22"/>
           <w:rtl/>
         </w:rPr>
-        <w:t xml:space="preserve">العنوان:    فرصة استثمارية مفتوحة للاكتتاب.</w:t>
+        <w:t xml:space="preserve">العنوان:    فلوسك الحين تشتغل.</w:t>
       </w:r>
     </w:p>
     <w:p>
@@ -2676,7 +2216,7 @@
           <w:szCs w:val="22"/>
           <w:rtl/>
         </w:rPr>
-        <w:t xml:space="preserve">الشرائح:   متاحة الآن  ·  تبدأ من ١,٠٠٠ ريال</w:t>
+        <w:t xml:space="preserve">الشرائح:   متاحة الآن  ·  توزيعات شهرية  ·  تبدأ من ١,٠٠٠ ريال</w:t>
       </w:r>
     </w:p>
     <w:p>
@@ -2733,7 +2273,7 @@
           <w:sz w:val="20"/>
           <w:szCs w:val="20"/>
         </w:rPr>
-        <w:t xml:space="preserve">T = 0 to T + 24h. Primary conversion post. Refresh funded percentage as it changes.</w:t>
+        <w:t xml:space="preserve">T = 0 to T + 24h, primary conversion.</w:t>
       </w:r>
     </w:p>
     <w:p>
@@ -2758,7 +2298,7 @@
           <w:sz w:val="20"/>
           <w:szCs w:val="20"/>
         </w:rPr>
-        <w:t xml:space="preserve">{{category}}, {{city}}, {{target_return}}, {{tenor}}, {{funded_pct}}</w:t>
+        <w:t xml:space="preserve">{{target_return}}, {{tenor}}, {{funded_pct}}</w:t>
       </w:r>
     </w:p>
     <w:p>
@@ -2803,33 +2343,33 @@
           <w:sz w:val="22"/>
           <w:szCs w:val="22"/>
         </w:rPr>
-        <w:t xml:space="preserve">Headline:  {{category}}, {{city}}.</w:t>
-      </w:r>
-    </w:p>
-    <w:p>
-      <w:pPr>
-        <w:spacing w:after="100"/>
-      </w:pPr>
-      <w:r>
-        <w:rPr>
-          <w:rFonts w:ascii="Arial" w:cs="Arial" w:eastAsia="Arial" w:hAnsi="Arial"/>
-          <w:sz w:val="22"/>
-          <w:szCs w:val="22"/>
-        </w:rPr>
-        <w:t xml:space="preserve">Body:      Underwritten by Alraedah. Alraedah co-invests 25% alongside you.</w:t>
-      </w:r>
-    </w:p>
-    <w:p>
-      <w:pPr>
-        <w:spacing w:after="100"/>
-      </w:pPr>
-      <w:r>
-        <w:rPr>
-          <w:rFonts w:ascii="Arial" w:cs="Arial" w:eastAsia="Arial" w:hAnsi="Arial"/>
-          <w:sz w:val="22"/>
-          <w:szCs w:val="22"/>
-        </w:rPr>
-        <w:t xml:space="preserve">Chips:     {{target_return}}% target p.a.  ·  {{tenor}} months  ·  {{funded_pct}}% funded</w:t>
+        <w:t xml:space="preserve">Headline:  Your next investment is live.</w:t>
+      </w:r>
+    </w:p>
+    <w:p>
+      <w:pPr>
+        <w:spacing w:after="100"/>
+      </w:pPr>
+      <w:r>
+        <w:rPr>
+          <w:rFonts w:ascii="Arial" w:cs="Arial" w:eastAsia="Arial" w:hAnsi="Arial"/>
+          <w:sz w:val="22"/>
+          <w:szCs w:val="22"/>
+        </w:rPr>
+        <w:t xml:space="preserve">Body:      Underwritten by Alraedah. Monthly payouts for the next {{tenor}} months.</w:t>
+      </w:r>
+    </w:p>
+    <w:p>
+      <w:pPr>
+        <w:spacing w:after="100"/>
+      </w:pPr>
+      <w:r>
+        <w:rPr>
+          <w:rFonts w:ascii="Arial" w:cs="Arial" w:eastAsia="Arial" w:hAnsi="Arial"/>
+          <w:sz w:val="22"/>
+          <w:szCs w:val="22"/>
+        </w:rPr>
+        <w:t xml:space="preserve">Chips:     {{target_return}}% target p.a.  ·  {{funded_pct}}% funded  ·  From SAR 1,000</w:t>
       </w:r>
     </w:p>
     <w:p>
@@ -2893,39 +2433,39 @@
           <w:szCs w:val="22"/>
           <w:rtl/>
         </w:rPr>
-        <w:t xml:space="preserve">العنوان:    {{category}}، {{city}}</w:t>
-      </w:r>
-    </w:p>
-    <w:p>
-      <w:pPr>
-        <w:bidi/>
-        <w:spacing w:after="100"/>
-        <w:jc w:val="right"/>
-      </w:pPr>
-      <w:r>
-        <w:rPr>
-          <w:rFonts w:ascii="Arial" w:cs="Arial" w:eastAsia="Arial" w:hAnsi="Arial"/>
-          <w:sz w:val="22"/>
-          <w:szCs w:val="22"/>
-          <w:rtl/>
-        </w:rPr>
-        <w:t xml:space="preserve">النص:      مدروسة من الرائدة. الرائدة تستثمر بنسبة ٢٥٪ معك.</w:t>
-      </w:r>
-    </w:p>
-    <w:p>
-      <w:pPr>
-        <w:bidi/>
-        <w:spacing w:after="100"/>
-        <w:jc w:val="right"/>
-      </w:pPr>
-      <w:r>
-        <w:rPr>
-          <w:rFonts w:ascii="Arial" w:cs="Arial" w:eastAsia="Arial" w:hAnsi="Arial"/>
-          <w:sz w:val="22"/>
-          <w:szCs w:val="22"/>
-          <w:rtl/>
-        </w:rPr>
-        <w:t xml:space="preserve">الشرائح:   عائد مستهدف {{target_return}}٪ سنوياً  ·  مدة {{tenor}} شهر  ·  تم تغطية {{funded_pct}}٪</w:t>
+        <w:t xml:space="preserve">العنوان:    استثمارك القادم متاح الآن.</w:t>
+      </w:r>
+    </w:p>
+    <w:p>
+      <w:pPr>
+        <w:bidi/>
+        <w:spacing w:after="100"/>
+        <w:jc w:val="right"/>
+      </w:pPr>
+      <w:r>
+        <w:rPr>
+          <w:rFonts w:ascii="Arial" w:cs="Arial" w:eastAsia="Arial" w:hAnsi="Arial"/>
+          <w:sz w:val="22"/>
+          <w:szCs w:val="22"/>
+          <w:rtl/>
+        </w:rPr>
+        <w:t xml:space="preserve">النص:      مدروسة من الرائدة. توزيعات شهرية على مدى {{tenor}} شهر القادمة.</w:t>
+      </w:r>
+    </w:p>
+    <w:p>
+      <w:pPr>
+        <w:bidi/>
+        <w:spacing w:after="100"/>
+        <w:jc w:val="right"/>
+      </w:pPr>
+      <w:r>
+        <w:rPr>
+          <w:rFonts w:ascii="Arial" w:cs="Arial" w:eastAsia="Arial" w:hAnsi="Arial"/>
+          <w:sz w:val="22"/>
+          <w:szCs w:val="22"/>
+          <w:rtl/>
+        </w:rPr>
+        <w:t xml:space="preserve">الشرائح:   عائد مستهدف {{target_return}}٪ سنوياً  ·  تم تغطية {{funded_pct}}٪  ·  تبدأ من ١,٠٠٠ ريال</w:t>
       </w:r>
     </w:p>
     <w:p>
@@ -2982,7 +2522,7 @@
           <w:sz w:val="20"/>
           <w:szCs w:val="20"/>
         </w:rPr>
-        <w:t xml:space="preserve">Post-funding, within 2 hours of full funding. Close the loop with social proof.</w:t>
+        <w:t xml:space="preserve">Within 2 hours of full funding.</w:t>
       </w:r>
     </w:p>
     <w:p>
@@ -3007,7 +2547,7 @@
           <w:sz w:val="20"/>
           <w:szCs w:val="20"/>
         </w:rPr>
-        <w:t xml:space="preserve">{{opportunity_name}}, {{investor_count}}, {{funded_hours}}, {{target_return}}, {{tenor}}, {{next_open_day}}</w:t>
+        <w:t xml:space="preserve">{{investor_count}}, {{funded_hours}}, {{target_return}}, {{tenor}}, {{next_open_day}}</w:t>
       </w:r>
     </w:p>
     <w:p>
@@ -3052,33 +2592,33 @@
           <w:sz w:val="22"/>
           <w:szCs w:val="22"/>
         </w:rPr>
-        <w:t xml:space="preserve">Headline:  {{opportunity_name}} is funded.</w:t>
-      </w:r>
-    </w:p>
-    <w:p>
-      <w:pPr>
-        <w:spacing w:after="100"/>
-      </w:pPr>
-      <w:r>
-        <w:rPr>
-          <w:rFonts w:ascii="Arial" w:cs="Arial" w:eastAsia="Arial" w:hAnsi="Arial"/>
-          <w:sz w:val="22"/>
-          <w:szCs w:val="22"/>
-        </w:rPr>
-        <w:t xml:space="preserve">Body:      {{investor_count}} investors, {{funded_hours}} hours. Monthly distributions start next month.</w:t>
-      </w:r>
-    </w:p>
-    <w:p>
-      <w:pPr>
-        <w:spacing w:after="100"/>
-      </w:pPr>
-      <w:r>
-        <w:rPr>
-          <w:rFonts w:ascii="Arial" w:cs="Arial" w:eastAsia="Arial" w:hAnsi="Arial"/>
-          <w:sz w:val="22"/>
-          <w:szCs w:val="22"/>
-        </w:rPr>
-        <w:t xml:space="preserve">Chips:     {{target_return}}% target  ·  {{tenor}} months  ·  Next opens {{next_open_day}}</w:t>
+        <w:t xml:space="preserve">Headline:  This week's opportunity is closed.</w:t>
+      </w:r>
+    </w:p>
+    <w:p>
+      <w:pPr>
+        <w:spacing w:after="100"/>
+      </w:pPr>
+      <w:r>
+        <w:rPr>
+          <w:rFonts w:ascii="Arial" w:cs="Arial" w:eastAsia="Arial" w:hAnsi="Arial"/>
+          <w:sz w:val="22"/>
+          <w:szCs w:val="22"/>
+        </w:rPr>
+        <w:t xml:space="preserve">Body:      {{investor_count}} investors joined. Monthly distributions begin next month.</w:t>
+      </w:r>
+    </w:p>
+    <w:p>
+      <w:pPr>
+        <w:spacing w:after="100"/>
+      </w:pPr>
+      <w:r>
+        <w:rPr>
+          <w:rFonts w:ascii="Arial" w:cs="Arial" w:eastAsia="Arial" w:hAnsi="Arial"/>
+          <w:sz w:val="22"/>
+          <w:szCs w:val="22"/>
+        </w:rPr>
+        <w:t xml:space="preserve">Chips:     Funded in {{funded_hours}}h  ·  {{target_return}}% target  ·  Next opens {{next_open_day}}</w:t>
       </w:r>
     </w:p>
     <w:p>
@@ -3142,39 +2682,39 @@
           <w:szCs w:val="22"/>
           <w:rtl/>
         </w:rPr>
-        <w:t xml:space="preserve">العنوان:    تم تغطية فرصة {{opportunity_name}}</w:t>
-      </w:r>
-    </w:p>
-    <w:p>
-      <w:pPr>
-        <w:bidi/>
-        <w:spacing w:after="100"/>
-        <w:jc w:val="right"/>
-      </w:pPr>
-      <w:r>
-        <w:rPr>
-          <w:rFonts w:ascii="Arial" w:cs="Arial" w:eastAsia="Arial" w:hAnsi="Arial"/>
-          <w:sz w:val="22"/>
-          <w:szCs w:val="22"/>
-          <w:rtl/>
-        </w:rPr>
-        <w:t xml:space="preserve">النص:      {{investor_count}} مستثمر، خلال {{funded_hours}} ساعة. التوزيعات الشهرية تبدأ الشهر القادم.</w:t>
-      </w:r>
-    </w:p>
-    <w:p>
-      <w:pPr>
-        <w:bidi/>
-        <w:spacing w:after="100"/>
-        <w:jc w:val="right"/>
-      </w:pPr>
-      <w:r>
-        <w:rPr>
-          <w:rFonts w:ascii="Arial" w:cs="Arial" w:eastAsia="Arial" w:hAnsi="Arial"/>
-          <w:sz w:val="22"/>
-          <w:szCs w:val="22"/>
-          <w:rtl/>
-        </w:rPr>
-        <w:t xml:space="preserve">الشرائح:   العائد المستهدف {{target_return}}٪  ·  مدة {{tenor}} شهر  ·  الفرصة القادمة {{next_open_day}}</w:t>
+        <w:t xml:space="preserve">العنوان:    فرصة هذا الأسبوع مغلقة.</w:t>
+      </w:r>
+    </w:p>
+    <w:p>
+      <w:pPr>
+        <w:bidi/>
+        <w:spacing w:after="100"/>
+        <w:jc w:val="right"/>
+      </w:pPr>
+      <w:r>
+        <w:rPr>
+          <w:rFonts w:ascii="Arial" w:cs="Arial" w:eastAsia="Arial" w:hAnsi="Arial"/>
+          <w:sz w:val="22"/>
+          <w:szCs w:val="22"/>
+          <w:rtl/>
+        </w:rPr>
+        <w:t xml:space="preserve">النص:      انضم {{investor_count}} مستثمر. التوزيعات الشهرية تبدأ الشهر القادم.</w:t>
+      </w:r>
+    </w:p>
+    <w:p>
+      <w:pPr>
+        <w:bidi/>
+        <w:spacing w:after="100"/>
+        <w:jc w:val="right"/>
+      </w:pPr>
+      <w:r>
+        <w:rPr>
+          <w:rFonts w:ascii="Arial" w:cs="Arial" w:eastAsia="Arial" w:hAnsi="Arial"/>
+          <w:sz w:val="22"/>
+          <w:szCs w:val="22"/>
+          <w:rtl/>
+        </w:rPr>
+        <w:t xml:space="preserve">الشرائح:   غُطّيت خلال {{funded_hours}} ساعة  ·  العائد المستهدف {{target_return}}٪  ·  القادمة {{next_open_day}}</w:t>
       </w:r>
     </w:p>
     <w:p>

</xml_diff>